<commit_message>
pages: sync paper (drop redundant references note)
Co-Authored-By: Claude Opus 4.8 <noreply@anthropic.com>
</commit_message>
<xml_diff>
--- a/paper.docx
+++ b/paper.docx
@@ -16587,27 +16587,6 @@
         </w:rPr>
         <w:t xml:space="preserve">1. </w:t>
       </w:r>
-      <w:r>
-        <w:t xml:space="preserve">In-text citations use the numbers below.</w:t>
-      </w:r>
-    </w:p>
-    <w:p>
-      <w:pPr>
-        <w:pStyle w:val="ReferenceEntry"/>
-        <w:spacing w:after="100"/>
-        <w:ind w:left="475" w:hanging="475"/>
-        <w:jc w:val="left"/>
-        <w:keepNext w:val="0"/>
-        <w:keepLines w:val="0"/>
-        <w:widowControl w:val="1"/>
-      </w:pPr>
-      <w:r>
-        <w:rPr>
-          <w:rFonts w:ascii="Times New Roman" w:hAnsi="Times New Roman"/>
-          <w:sz w:val="20"/>
-        </w:rPr>
-        <w:t xml:space="preserve">2. </w:t>
-      </w:r>
       <w:bookmarkStart w:id="40" w:name="r-kim"/>
       <w:r>
         <w:t xml:space="preserve">S. Kim, K. Choi, H.-S. Choi, B. Lee, and S. Yoon. “Towards a Rigorous Evaluation of</w:t>
@@ -16682,7 +16661,7 @@
           <w:rFonts w:ascii="Times New Roman" w:hAnsi="Times New Roman"/>
           <w:sz w:val="20"/>
         </w:rPr>
-        <w:t xml:space="preserve">3. </w:t>
+        <w:t xml:space="preserve">2. </w:t>
       </w:r>
       <w:bookmarkStart w:id="42" w:name="r-garg"/>
       <w:r>
@@ -16758,7 +16737,7 @@
           <w:rFonts w:ascii="Times New Roman" w:hAnsi="Times New Roman"/>
           <w:sz w:val="20"/>
         </w:rPr>
-        <w:t xml:space="preserve">4. </w:t>
+        <w:t xml:space="preserve">3. </w:t>
       </w:r>
       <w:bookmarkStart w:id="44" w:name="r-wukeogh"/>
       <w:r>
@@ -16814,7 +16793,7 @@
           <w:rFonts w:ascii="Times New Roman" w:hAnsi="Times New Roman"/>
           <w:sz w:val="20"/>
         </w:rPr>
-        <w:t xml:space="preserve">5. </w:t>
+        <w:t xml:space="preserve">4. </w:t>
       </w:r>
       <w:bookmarkStart w:id="46" w:name="r-doshi"/>
       <w:r>
@@ -16870,7 +16849,7 @@
           <w:rFonts w:ascii="Times New Roman" w:hAnsi="Times New Roman"/>
           <w:sz w:val="20"/>
         </w:rPr>
-        <w:t xml:space="preserve">6. </w:t>
+        <w:t xml:space="preserve">5. </w:t>
       </w:r>
       <w:bookmarkStart w:id="48" w:name="r-univar"/>
       <w:r>
@@ -16913,7 +16892,7 @@
           <w:rFonts w:ascii="Times New Roman" w:hAnsi="Times New Roman"/>
           <w:sz w:val="20"/>
         </w:rPr>
-        <w:t xml:space="preserve">7. </w:t>
+        <w:t xml:space="preserve">6. </w:t>
       </w:r>
       <w:bookmarkStart w:id="50" w:name="r-usad"/>
       <w:r>
@@ -16983,7 +16962,7 @@
           <w:rFonts w:ascii="Times New Roman" w:hAnsi="Times New Roman"/>
           <w:sz w:val="20"/>
         </w:rPr>
-        <w:t xml:space="preserve">8. </w:t>
+        <w:t xml:space="preserve">7. </w:t>
       </w:r>
       <w:bookmarkStart w:id="52" w:name="r-tranad"/>
       <w:r>
@@ -17039,7 +17018,7 @@
           <w:rFonts w:ascii="Times New Roman" w:hAnsi="Times New Roman"/>
           <w:sz w:val="20"/>
         </w:rPr>
-        <w:t xml:space="preserve">9. </w:t>
+        <w:t xml:space="preserve">8. </w:t>
       </w:r>
       <w:bookmarkStart w:id="54" w:name="r-vade"/>
       <w:r>
@@ -17109,7 +17088,7 @@
           <w:rFonts w:ascii="Times New Roman" w:hAnsi="Times New Roman"/>
           <w:sz w:val="20"/>
         </w:rPr>
-        <w:t xml:space="preserve">10. </w:t>
+        <w:t xml:space="preserve">9. </w:t>
       </w:r>
       <w:bookmarkStart w:id="56" w:name="r-dagmm"/>
       <w:r>
@@ -17179,7 +17158,7 @@
           <w:rFonts w:ascii="Times New Roman" w:hAnsi="Times New Roman"/>
           <w:sz w:val="20"/>
         </w:rPr>
-        <w:t xml:space="preserve">11. </w:t>
+        <w:t xml:space="preserve">10. </w:t>
       </w:r>
       <w:bookmarkStart w:id="58" w:name="r-gdn"/>
       <w:r>
@@ -17235,7 +17214,7 @@
           <w:rFonts w:ascii="Times New Roman" w:hAnsi="Times New Roman"/>
           <w:sz w:val="20"/>
         </w:rPr>
-        <w:t xml:space="preserve">12. </w:t>
+        <w:t xml:space="preserve">11. </w:t>
       </w:r>
       <w:bookmarkStart w:id="60" w:name="r-if"/>
       <w:r>
@@ -17299,7 +17278,7 @@
           <w:rFonts w:ascii="Times New Roman" w:hAnsi="Times New Roman"/>
           <w:sz w:val="20"/>
         </w:rPr>
-        <w:t xml:space="preserve">13. </w:t>
+        <w:t xml:space="preserve">12. </w:t>
       </w:r>
       <w:bookmarkStart w:id="62" w:name="r-lw"/>
       <w:r>
@@ -17355,7 +17334,7 @@
           <w:rFonts w:ascii="Times New Roman" w:hAnsi="Times New Roman"/>
           <w:sz w:val="20"/>
         </w:rPr>
-        <w:t xml:space="preserve">14. </w:t>
+        <w:t xml:space="preserve">13. </w:t>
       </w:r>
       <w:bookmarkStart w:id="64" w:name="r-wadi"/>
       <w:r>
@@ -17425,7 +17404,7 @@
           <w:rFonts w:ascii="Times New Roman" w:hAnsi="Times New Roman"/>
           <w:sz w:val="20"/>
         </w:rPr>
-        <w:t xml:space="preserve">15. </w:t>
+        <w:t xml:space="preserve">14. </w:t>
       </w:r>
       <w:bookmarkStart w:id="66" w:name="r-hai"/>
       <w:r>
@@ -17481,7 +17460,7 @@
           <w:rFonts w:ascii="Times New Roman" w:hAnsi="Times New Roman"/>
           <w:sz w:val="20"/>
         </w:rPr>
-        <w:t xml:space="preserve">16. </w:t>
+        <w:t xml:space="preserve">15. </w:t>
       </w:r>
       <w:bookmarkStart w:id="68" w:name="r-skab"/>
       <w:r>
@@ -17524,7 +17503,7 @@
           <w:rFonts w:ascii="Times New Roman" w:hAnsi="Times New Roman"/>
           <w:sz w:val="20"/>
         </w:rPr>
-        <w:t xml:space="preserve">17. </w:t>
+        <w:t xml:space="preserve">16. </w:t>
       </w:r>
       <w:bookmarkStart w:id="70" w:name="r-bouman"/>
       <w:r>
@@ -17561,7 +17540,7 @@
           <w:rFonts w:ascii="Times New Roman" w:hAnsi="Times New Roman"/>
           <w:sz w:val="20"/>
         </w:rPr>
-        <w:t xml:space="preserve">18. </w:t>
+        <w:t xml:space="preserve">17. </w:t>
       </w:r>
       <w:bookmarkStart w:id="72" w:name="r-memae"/>
       <w:r>
@@ -17611,7 +17590,7 @@
           <w:rFonts w:ascii="Times New Roman" w:hAnsi="Times New Roman"/>
           <w:sz w:val="20"/>
         </w:rPr>
-        <w:t xml:space="preserve">19. </w:t>
+        <w:t xml:space="preserve">18. </w:t>
       </w:r>
       <w:bookmarkStart w:id="74" w:name="r-sarfraz"/>
       <w:r>
@@ -17661,7 +17640,7 @@
           <w:rFonts w:ascii="Times New Roman" w:hAnsi="Times New Roman"/>
           <w:sz w:val="20"/>
         </w:rPr>
-        <w:t xml:space="preserve">20. </w:t>
+        <w:t xml:space="preserve">19. </w:t>
       </w:r>
       <w:bookmarkStart w:id="76" w:name="r-timesead"/>
       <w:r>
@@ -17711,7 +17690,7 @@
           <w:rFonts w:ascii="Times New Roman" w:hAnsi="Times New Roman"/>
           <w:sz w:val="20"/>
         </w:rPr>
-        <w:t xml:space="preserve">21. </w:t>
+        <w:t xml:space="preserve">20. </w:t>
       </w:r>
       <w:bookmarkStart w:id="78" w:name="r-swat"/>
       <w:r>
@@ -17761,7 +17740,7 @@
           <w:rFonts w:ascii="Times New Roman" w:hAnsi="Times New Roman"/>
           <w:sz w:val="20"/>
         </w:rPr>
-        <w:t xml:space="preserve">22. </w:t>
+        <w:t xml:space="preserve">21. </w:t>
       </w:r>
       <w:bookmarkStart w:id="80" w:name="r-aead"/>
       <w:r>
@@ -17811,7 +17790,7 @@
           <w:rFonts w:ascii="Times New Roman" w:hAnsi="Times New Roman"/>
           <w:sz w:val="20"/>
         </w:rPr>
-        <w:t xml:space="preserve">23. </w:t>
+        <w:t xml:space="preserve">22. </w:t>
       </w:r>
       <w:bookmarkStart w:id="82" w:name="r-chandola"/>
       <w:r>
@@ -17861,7 +17840,7 @@
           <w:rFonts w:ascii="Times New Roman" w:hAnsi="Times New Roman"/>
           <w:sz w:val="20"/>
         </w:rPr>
-        <w:t xml:space="preserve">24. </w:t>
+        <w:t xml:space="preserve">23. </w:t>
       </w:r>
       <w:bookmarkStart w:id="84" w:name="r-pang"/>
       <w:r>
@@ -17911,7 +17890,7 @@
           <w:rFonts w:ascii="Times New Roman" w:hAnsi="Times New Roman"/>
           <w:sz w:val="20"/>
         </w:rPr>
-        <w:t xml:space="preserve">25. </w:t>
+        <w:t xml:space="preserve">24. </w:t>
       </w:r>
       <w:bookmarkStart w:id="86" w:name="r-ruff"/>
       <w:r>
@@ -17961,7 +17940,7 @@
           <w:rFonts w:ascii="Times New Roman" w:hAnsi="Times New Roman"/>
           <w:sz w:val="20"/>
         </w:rPr>
-        <w:t xml:space="preserve">26. </w:t>
+        <w:t xml:space="preserve">25. </w:t>
       </w:r>
       <w:bookmarkStart w:id="88" w:name="r-tsreview"/>
       <w:r>
@@ -18011,7 +17990,7 @@
           <w:rFonts w:ascii="Times New Roman" w:hAnsi="Times New Roman"/>
           <w:sz w:val="20"/>
         </w:rPr>
-        <w:t xml:space="preserve">27. </w:t>
+        <w:t xml:space="preserve">26. </w:t>
       </w:r>
       <w:bookmarkStart w:id="90" w:name="r-icssurvey"/>
       <w:r>

</xml_diff>

<commit_message>
pages: sync paper (drop Contents ToC)
Co-Authored-By: Claude Opus 4.8 <noreply@anthropic.com>
</commit_message>
<xml_diff>
--- a/paper.docx
+++ b/paper.docx
@@ -314,71 +314,6 @@
       </w:r>
     </w:p>
     <w:bookmarkEnd w:id="9"/>
-    <w:p>
-      <w:pPr>
-        <w:pStyle w:val="BodyText"/>
-        <w:ind w:left="720" w:right="720" w:firstLine="0"/>
-        <w:jc w:val="both"/>
-        <w:keepNext w:val="0"/>
-        <w:keepLines w:val="0"/>
-        <w:widowControl w:val="1"/>
-      </w:pPr>
-      <w:r>
-        <w:rPr>
-          <w:b/>
-          <w:bCs/>
-        </w:rPr>
-        <w:t xml:space="preserve">Contents.</w:t>
-      </w:r>
-      <w:r>
-        <w:t xml:space="preserve"> </w:t>
-      </w:r>
-      <w:r>
-        <w:t xml:space="preserve">1 Introduction ·</w:t>
-      </w:r>
-      <w:r>
-        <w:t xml:space="preserve"> </w:t>
-      </w:r>
-      <w:r>
-        <w:t xml:space="preserve">2 Related work ·</w:t>
-      </w:r>
-      <w:r>
-        <w:t xml:space="preserve"> </w:t>
-      </w:r>
-      <w:r>
-        <w:t xml:space="preserve">3 The MIIM assumptions about CPS normal data ·</w:t>
-      </w:r>
-      <w:r>
-        <w:t xml:space="preserve"> </w:t>
-      </w:r>
-      <w:r>
-        <w:t xml:space="preserve">4 Method ·</w:t>
-      </w:r>
-      <w:r>
-        <w:t xml:space="preserve"> </w:t>
-      </w:r>
-      <w:r>
-        <w:t xml:space="preserve">5 Experimental methodology ·</w:t>
-      </w:r>
-      <w:r>
-        <w:t xml:space="preserve"> </w:t>
-      </w:r>
-      <w:r>
-        <w:t xml:space="preserve">6 Results ·</w:t>
-      </w:r>
-      <w:r>
-        <w:t xml:space="preserve"> </w:t>
-      </w:r>
-      <w:r>
-        <w:t xml:space="preserve">7 Discussion ·</w:t>
-      </w:r>
-      <w:r>
-        <w:t xml:space="preserve"> </w:t>
-      </w:r>
-      <w:r>
-        <w:t xml:space="preserve">8 Conclusion.</w:t>
-      </w:r>
-    </w:p>
     <w:bookmarkStart w:id="10" w:name="introduction"/>
     <w:p>
       <w:pPr>

</xml_diff>

<commit_message>
pages: sync paper (Results section rekeyed, no ToC subsection)
Co-Authored-By: Claude Opus 4.8 <noreply@anthropic.com>
</commit_message>
<xml_diff>
--- a/paper.docx
+++ b/paper.docx
@@ -2,7 +2,7 @@
 <file path=word/document.xml><?xml version="1.0" encoding="utf-8"?>
 <w:document xmlns:w="http://schemas.openxmlformats.org/wordprocessingml/2006/main" xmlns:m="http://schemas.openxmlformats.org/officeDocument/2006/math" xmlns:r="http://schemas.openxmlformats.org/officeDocument/2006/relationships" xmlns:o="urn:schemas-microsoft-com:office:office" xmlns:v="urn:schemas-microsoft-com:vml" xmlns:w10="urn:schemas-microsoft-com:office:word" xmlns:a="http://schemas.openxmlformats.org/drawingml/2006/main" xmlns:pic="http://schemas.openxmlformats.org/drawingml/2006/picture" xmlns:wp="http://schemas.openxmlformats.org/drawingml/2006/wordprocessingDrawing">
   <w:body>
-    <w:bookmarkStart w:id="92" w:name="X82f8a503c88a86fef885ebbff7266bf4401a396"/>
+    <w:bookmarkStart w:id="91" w:name="X82f8a503c88a86fef885ebbff7266bf4401a396"/>
     <w:p>
       <w:pPr>
         <w:pStyle w:val="Title"/>
@@ -7442,7 +7442,7 @@
     </w:p>
     <w:bookmarkEnd w:id="29"/>
     <w:bookmarkEnd w:id="30"/>
-    <w:bookmarkStart w:id="35" w:name="results"/>
+    <w:bookmarkStart w:id="34" w:name="results"/>
     <w:p>
       <w:pPr>
         <w:pStyle w:val="Heading2"/>
@@ -15596,21 +15596,10 @@
         </w:tc>
       </w:tr>
     </w:tbl>
-    <w:bookmarkStart w:id="34" w:name="reading-the-table"/>
     <w:p>
       <w:pPr>
-        <w:pStyle w:val="Heading3"/>
-        <w:keepNext/>
-        <w:keepLines/>
-        <w:widowControl w:val="1"/>
-      </w:pPr>
-      <w:r>
-        <w:t xml:space="preserve">6.1  Reading the table</w:t>
-      </w:r>
-    </w:p>
-    <w:p>
-      <w:pPr>
-        <w:pStyle w:val="FirstParagraph"/>
+        <w:pStyle w:val="BodyText"/>
+        <w:spacing w:before="240"/>
         <w:jc w:val="both"/>
         <w:keepNext w:val="0"/>
         <w:keepLines w:val="0"/>
@@ -15621,7 +15610,7 @@
           <w:b/>
           <w:bCs/>
         </w:rPr>
-        <w:t xml:space="preserve">Combined (All) column.</w:t>
+        <w:t xml:space="preserve">Overall detection.</w:t>
       </w:r>
       <w:r>
         <w:t xml:space="preserve"> </w:t>
@@ -15667,13 +15656,13 @@
           <w:b/>
           <w:bCs/>
         </w:rPr>
-        <w:t xml:space="preserve">Difficult column.</w:t>
-      </w:r>
-      <w:r>
-        <w:t xml:space="preserve"> </w:t>
-      </w:r>
-      <w:r>
-        <w:t xml:space="preserve">This is where the design earns its keep, and the model leads it on all three</w:t>
+        <w:t xml:space="preserve">Difficult, joint-structure faults.</w:t>
+      </w:r>
+      <w:r>
+        <w:t xml:space="preserve"> </w:t>
+      </w:r>
+      <w:r>
+        <w:t xml:space="preserve">This is where the design earns its keep, and the model leads the difficult subset on all three</w:t>
       </w:r>
       <w:r>
         <w:t xml:space="preserve"> </w:t>
@@ -15725,13 +15714,13 @@
           <w:b/>
           <w:bCs/>
         </w:rPr>
-        <w:t xml:space="preserve">Easy column.</w:t>
-      </w:r>
-      <w:r>
-        <w:t xml:space="preserve"> </w:t>
-      </w:r>
-      <w:r>
-        <w:t xml:space="preserve">On the trivially separable anomalies every method is strong and the ranking is</w:t>
+        <w:t xml:space="preserve">Trivially separable anomalies.</w:t>
+      </w:r>
+      <w:r>
+        <w:t xml:space="preserve"> </w:t>
+      </w:r>
+      <w:r>
+        <w:t xml:space="preserve">On the easy subset every method is strong and the ranking is</w:t>
       </w:r>
       <w:r>
         <w:t xml:space="preserve"> </w:t>
@@ -15771,7 +15760,7 @@
           <w:b/>
           <w:bCs/>
         </w:rPr>
-        <w:t xml:space="preserve">The trivial baseline defines the split.</w:t>
+        <w:t xml:space="preserve">Validity of the difficulty split.</w:t>
       </w:r>
       <w:r>
         <w:t xml:space="preserve"> </w:t>
@@ -15811,7 +15800,7 @@
           <w:b/>
           <w:bCs/>
         </w:rPr>
-        <w:t xml:space="preserve">SOTA under raw metrics.</w:t>
+        <w:t xml:space="preserve">Deep SOTA under raw metrics.</w:t>
       </w:r>
       <w:r>
         <w:t xml:space="preserve"> </w:t>
@@ -15927,8 +15916,7 @@
       </w:r>
     </w:p>
     <w:bookmarkEnd w:id="34"/>
-    <w:bookmarkEnd w:id="35"/>
-    <w:bookmarkStart w:id="36" w:name="discussion"/>
+    <w:bookmarkStart w:id="35" w:name="discussion"/>
     <w:p>
       <w:pPr>
         <w:pStyle w:val="Heading2"/>
@@ -16399,8 +16387,8 @@
         <w:t xml:space="preserve">raw metrics, which makes our numbers look lower than point-adjusted leaderboard figures by design.</w:t>
       </w:r>
     </w:p>
-    <w:bookmarkEnd w:id="36"/>
-    <w:bookmarkStart w:id="37" w:name="conclusion"/>
+    <w:bookmarkEnd w:id="35"/>
+    <w:bookmarkStart w:id="36" w:name="conclusion"/>
     <w:p>
       <w:pPr>
         <w:pStyle w:val="Heading2"/>
@@ -16491,8 +16479,8 @@
         </w:pict>
       </w:r>
     </w:p>
-    <w:bookmarkEnd w:id="37"/>
-    <w:bookmarkStart w:id="91" w:name="references"/>
+    <w:bookmarkEnd w:id="36"/>
+    <w:bookmarkStart w:id="90" w:name="references"/>
     <w:p>
       <w:pPr>
         <w:pStyle w:val="ReferencesHeading"/>
@@ -16522,7 +16510,7 @@
         </w:rPr>
         <w:t xml:space="preserve">1. </w:t>
       </w:r>
-      <w:bookmarkStart w:id="40" w:name="r-kim"/>
+      <w:bookmarkStart w:id="39" w:name="r-kim"/>
       <w:r>
         <w:t xml:space="preserve">S. Kim, K. Choi, H.-S. Choi, B. Lee, and S. Yoon. “Towards a Rigorous Evaluation of</w:t>
       </w:r>
@@ -16554,7 +16542,7 @@
       <w:r>
         <w:t xml:space="preserve"> </w:t>
       </w:r>
-      <w:hyperlink r:id="rId38">
+      <w:hyperlink r:id="rId37">
         <w:r>
           <w:rPr>
             <w:rStyle w:val="Hyperlink"/>
@@ -16568,7 +16556,7 @@
       <w:r>
         <w:t xml:space="preserve"> </w:t>
       </w:r>
-      <w:hyperlink r:id="rId39">
+      <w:hyperlink r:id="rId38">
         <w:r>
           <w:rPr>
             <w:rStyle w:val="Hyperlink"/>
@@ -16579,7 +16567,7 @@
       <w:r>
         <w:t xml:space="preserve">.</w:t>
       </w:r>
-      <w:bookmarkEnd w:id="40"/>
+      <w:bookmarkEnd w:id="39"/>
     </w:p>
     <w:p>
       <w:pPr>
@@ -16598,7 +16586,7 @@
         </w:rPr>
         <w:t xml:space="preserve">2. </w:t>
       </w:r>
-      <w:bookmarkStart w:id="42" w:name="r-garg"/>
+      <w:bookmarkStart w:id="41" w:name="r-garg"/>
       <w:r>
         <w:t xml:space="preserve">A. Garg, W. Zhang, J. Samaran, R. Savitha, and C.-S. Foo. “An Evaluation of Anomaly</w:t>
       </w:r>
@@ -16638,7 +16626,7 @@
       <w:r>
         <w:t xml:space="preserve"> </w:t>
       </w:r>
-      <w:hyperlink r:id="rId41">
+      <w:hyperlink r:id="rId40">
         <w:r>
           <w:rPr>
             <w:rStyle w:val="Hyperlink"/>
@@ -16655,7 +16643,7 @@
       <w:r>
         <w:t xml:space="preserve">doi:10.1109/TNNLS.2021.3105827.</w:t>
       </w:r>
-      <w:bookmarkEnd w:id="42"/>
+      <w:bookmarkEnd w:id="41"/>
     </w:p>
     <w:p>
       <w:pPr>
@@ -16674,7 +16662,7 @@
         </w:rPr>
         <w:t xml:space="preserve">3. </w:t>
       </w:r>
-      <w:bookmarkStart w:id="44" w:name="r-wukeogh"/>
+      <w:bookmarkStart w:id="43" w:name="r-wukeogh"/>
       <w:r>
         <w:t xml:space="preserve">R. Wu and E. J. Keogh. “Current Time Series Anomaly Detection Benchmarks are Flawed and</w:t>
       </w:r>
@@ -16700,7 +16688,7 @@
       <w:r>
         <w:t xml:space="preserve"> </w:t>
       </w:r>
-      <w:hyperlink r:id="rId43">
+      <w:hyperlink r:id="rId42">
         <w:r>
           <w:rPr>
             <w:rStyle w:val="Hyperlink"/>
@@ -16711,7 +16699,7 @@
       <w:r>
         <w:t xml:space="preserve">, doi:10.1109/TKDE.2021.3112126.</w:t>
       </w:r>
-      <w:bookmarkEnd w:id="44"/>
+      <w:bookmarkEnd w:id="43"/>
     </w:p>
     <w:p>
       <w:pPr>
@@ -16730,7 +16718,7 @@
         </w:rPr>
         <w:t xml:space="preserve">4. </w:t>
       </w:r>
-      <w:bookmarkStart w:id="46" w:name="r-doshi"/>
+      <w:bookmarkStart w:id="45" w:name="r-doshi"/>
       <w:r>
         <w:t xml:space="preserve">K. Doshi, S. Abudalou, and Y. Yilmaz. “Reward Once, Penalize Once: Rectifying Time Series</w:t>
       </w:r>
@@ -16756,7 +16744,7 @@
       <w:r>
         <w:t xml:space="preserve"> </w:t>
       </w:r>
-      <w:hyperlink r:id="rId45">
+      <w:hyperlink r:id="rId44">
         <w:r>
           <w:rPr>
             <w:rStyle w:val="Hyperlink"/>
@@ -16767,7 +16755,7 @@
       <w:r>
         <w:t xml:space="preserve">.</w:t>
       </w:r>
-      <w:bookmarkEnd w:id="46"/>
+      <w:bookmarkEnd w:id="45"/>
     </w:p>
     <w:p>
       <w:pPr>
@@ -16786,7 +16774,7 @@
         </w:rPr>
         <w:t xml:space="preserve">5. </w:t>
       </w:r>
-      <w:bookmarkStart w:id="48" w:name="r-univar"/>
+      <w:bookmarkStart w:id="47" w:name="r-univar"/>
       <w:r>
         <w:t xml:space="preserve">M. Pinet, J. Cumin, S. Berlemont, and D. Vaufreydaz. “Anomalies in Multivariate Time Series</w:t>
       </w:r>
@@ -16799,7 +16787,7 @@
       <w:r>
         <w:t xml:space="preserve"> </w:t>
       </w:r>
-      <w:hyperlink r:id="rId47">
+      <w:hyperlink r:id="rId46">
         <w:r>
           <w:rPr>
             <w:rStyle w:val="Hyperlink"/>
@@ -16810,7 +16798,7 @@
       <w:r>
         <w:t xml:space="preserve">.</w:t>
       </w:r>
-      <w:bookmarkEnd w:id="48"/>
+      <w:bookmarkEnd w:id="47"/>
     </w:p>
     <w:p>
       <w:pPr>
@@ -16829,7 +16817,7 @@
         </w:rPr>
         <w:t xml:space="preserve">6. </w:t>
       </w:r>
-      <w:bookmarkStart w:id="50" w:name="r-usad"/>
+      <w:bookmarkStart w:id="49" w:name="r-usad"/>
       <w:r>
         <w:t xml:space="preserve">J. Audibert, P. Michiardi, F. Guyard, S. Marti, and M. A. Zuluaga. “USAD: UnSupervised</w:t>
       </w:r>
@@ -16869,7 +16857,7 @@
       <w:r>
         <w:t xml:space="preserve"> </w:t>
       </w:r>
-      <w:hyperlink r:id="rId49">
+      <w:hyperlink r:id="rId48">
         <w:r>
           <w:rPr>
             <w:rStyle w:val="Hyperlink"/>
@@ -16880,7 +16868,7 @@
       <w:r>
         <w:t xml:space="preserve">.</w:t>
       </w:r>
-      <w:bookmarkEnd w:id="50"/>
+      <w:bookmarkEnd w:id="49"/>
     </w:p>
     <w:p>
       <w:pPr>
@@ -16899,7 +16887,7 @@
         </w:rPr>
         <w:t xml:space="preserve">7. </w:t>
       </w:r>
-      <w:bookmarkStart w:id="52" w:name="r-tranad"/>
+      <w:bookmarkStart w:id="51" w:name="r-tranad"/>
       <w:r>
         <w:t xml:space="preserve">S. Tuli, G. Casale, and N. R. Jennings. “TranAD: Deep Transformer Networks for Anomaly</w:t>
       </w:r>
@@ -16925,7 +16913,7 @@
       <w:r>
         <w:t xml:space="preserve"> </w:t>
       </w:r>
-      <w:hyperlink r:id="rId51">
+      <w:hyperlink r:id="rId50">
         <w:r>
           <w:rPr>
             <w:rStyle w:val="Hyperlink"/>
@@ -16936,7 +16924,7 @@
       <w:r>
         <w:t xml:space="preserve">.</w:t>
       </w:r>
-      <w:bookmarkEnd w:id="52"/>
+      <w:bookmarkEnd w:id="51"/>
     </w:p>
     <w:p>
       <w:pPr>
@@ -16955,7 +16943,7 @@
         </w:rPr>
         <w:t xml:space="preserve">8. </w:t>
       </w:r>
-      <w:bookmarkStart w:id="54" w:name="r-vade"/>
+      <w:bookmarkStart w:id="53" w:name="r-vade"/>
       <w:r>
         <w:t xml:space="preserve">Z. Jiang, Y. Zheng, H. Tan, B. Tang, and H. Zhou. “Variational Deep Embedding: An</w:t>
       </w:r>
@@ -16995,7 +16983,7 @@
       <w:r>
         <w:t xml:space="preserve"> </w:t>
       </w:r>
-      <w:hyperlink r:id="rId53">
+      <w:hyperlink r:id="rId52">
         <w:r>
           <w:rPr>
             <w:rStyle w:val="Hyperlink"/>
@@ -17006,7 +16994,7 @@
       <w:r>
         <w:t xml:space="preserve">.</w:t>
       </w:r>
-      <w:bookmarkEnd w:id="54"/>
+      <w:bookmarkEnd w:id="53"/>
     </w:p>
     <w:p>
       <w:pPr>
@@ -17025,7 +17013,7 @@
         </w:rPr>
         <w:t xml:space="preserve">9. </w:t>
       </w:r>
-      <w:bookmarkStart w:id="56" w:name="r-dagmm"/>
+      <w:bookmarkStart w:id="55" w:name="r-dagmm"/>
       <w:r>
         <w:t xml:space="preserve">B. Zong, Q. Song, M. R. Min, W. Cheng, C. Lumezanu, D. Cho, and H. Chen. “Deep</w:t>
       </w:r>
@@ -17065,7 +17053,7 @@
       <w:r>
         <w:t xml:space="preserve"> </w:t>
       </w:r>
-      <w:hyperlink r:id="rId55">
+      <w:hyperlink r:id="rId54">
         <w:r>
           <w:rPr>
             <w:rStyle w:val="Hyperlink"/>
@@ -17076,7 +17064,7 @@
       <w:r>
         <w:t xml:space="preserve">.</w:t>
       </w:r>
-      <w:bookmarkEnd w:id="56"/>
+      <w:bookmarkEnd w:id="55"/>
     </w:p>
     <w:p>
       <w:pPr>
@@ -17095,7 +17083,7 @@
         </w:rPr>
         <w:t xml:space="preserve">10. </w:t>
       </w:r>
-      <w:bookmarkStart w:id="58" w:name="r-gdn"/>
+      <w:bookmarkStart w:id="57" w:name="r-gdn"/>
       <w:r>
         <w:t xml:space="preserve">A. Deng and B. Hooi. “Graph Neural Network-Based Anomaly Detection in Multivariate Time</w:t>
       </w:r>
@@ -17121,7 +17109,7 @@
       <w:r>
         <w:t xml:space="preserve"> </w:t>
       </w:r>
-      <w:hyperlink r:id="rId57">
+      <w:hyperlink r:id="rId56">
         <w:r>
           <w:rPr>
             <w:rStyle w:val="Hyperlink"/>
@@ -17132,7 +17120,7 @@
       <w:r>
         <w:t xml:space="preserve">.</w:t>
       </w:r>
-      <w:bookmarkEnd w:id="58"/>
+      <w:bookmarkEnd w:id="57"/>
     </w:p>
     <w:p>
       <w:pPr>
@@ -17151,7 +17139,7 @@
         </w:rPr>
         <w:t xml:space="preserve">11. </w:t>
       </w:r>
-      <w:bookmarkStart w:id="60" w:name="r-if"/>
+      <w:bookmarkStart w:id="59" w:name="r-if"/>
       <w:r>
         <w:t xml:space="preserve">F. T. Liu, K. M. Ting, and Z.-H. Zhou. “Isolation Forest.”</w:t>
       </w:r>
@@ -17185,7 +17173,7 @@
       <w:r>
         <w:t xml:space="preserve"> </w:t>
       </w:r>
-      <w:hyperlink r:id="rId59">
+      <w:hyperlink r:id="rId58">
         <w:r>
           <w:rPr>
             <w:rStyle w:val="Hyperlink"/>
@@ -17196,7 +17184,7 @@
       <w:r>
         <w:t xml:space="preserve">.</w:t>
       </w:r>
-      <w:bookmarkEnd w:id="60"/>
+      <w:bookmarkEnd w:id="59"/>
     </w:p>
     <w:p>
       <w:pPr>
@@ -17215,7 +17203,7 @@
         </w:rPr>
         <w:t xml:space="preserve">12. </w:t>
       </w:r>
-      <w:bookmarkStart w:id="62" w:name="r-lw"/>
+      <w:bookmarkStart w:id="61" w:name="r-lw"/>
       <w:r>
         <w:t xml:space="preserve">O. Ledoit and M. Wolf. “A Well-Conditioned Estimator for Large-Dimensional Covariance</w:t>
       </w:r>
@@ -17241,7 +17229,7 @@
       <w:r>
         <w:t xml:space="preserve"> </w:t>
       </w:r>
-      <w:hyperlink r:id="rId61">
+      <w:hyperlink r:id="rId60">
         <w:r>
           <w:rPr>
             <w:rStyle w:val="Hyperlink"/>
@@ -17252,7 +17240,7 @@
       <w:r>
         <w:t xml:space="preserve">.</w:t>
       </w:r>
-      <w:bookmarkEnd w:id="62"/>
+      <w:bookmarkEnd w:id="61"/>
     </w:p>
     <w:p>
       <w:pPr>
@@ -17271,7 +17259,7 @@
         </w:rPr>
         <w:t xml:space="preserve">13. </w:t>
       </w:r>
-      <w:bookmarkStart w:id="64" w:name="r-wadi"/>
+      <w:bookmarkStart w:id="63" w:name="r-wadi"/>
       <w:r>
         <w:t xml:space="preserve">C. M. Ahmed, V. R. Palleti, and A. P. Mathur. “WADI: A Water Distribution Testbed for</w:t>
       </w:r>
@@ -17311,7 +17299,7 @@
       <w:r>
         <w:t xml:space="preserve"> </w:t>
       </w:r>
-      <w:hyperlink r:id="rId63">
+      <w:hyperlink r:id="rId62">
         <w:r>
           <w:rPr>
             <w:rStyle w:val="Hyperlink"/>
@@ -17322,7 +17310,7 @@
       <w:r>
         <w:t xml:space="preserve">.</w:t>
       </w:r>
-      <w:bookmarkEnd w:id="64"/>
+      <w:bookmarkEnd w:id="63"/>
     </w:p>
     <w:p>
       <w:pPr>
@@ -17341,7 +17329,7 @@
         </w:rPr>
         <w:t xml:space="preserve">14. </w:t>
       </w:r>
-      <w:bookmarkStart w:id="66" w:name="r-hai"/>
+      <w:bookmarkStart w:id="65" w:name="r-hai"/>
       <w:r>
         <w:t xml:space="preserve">H.-K. Shin, W. Lee, J.-H. Yun, and H. Kim. “HAI 1.0: HIL-based Augmented ICS Security</w:t>
       </w:r>
@@ -17367,7 +17355,7 @@
       <w:r>
         <w:t xml:space="preserve"> </w:t>
       </w:r>
-      <w:hyperlink r:id="rId65">
+      <w:hyperlink r:id="rId64">
         <w:r>
           <w:rPr>
             <w:rStyle w:val="Hyperlink"/>
@@ -17378,7 +17366,7 @@
       <w:r>
         <w:t xml:space="preserve">.</w:t>
       </w:r>
-      <w:bookmarkEnd w:id="66"/>
+      <w:bookmarkEnd w:id="65"/>
     </w:p>
     <w:p>
       <w:pPr>
@@ -17397,7 +17385,7 @@
         </w:rPr>
         <w:t xml:space="preserve">15. </w:t>
       </w:r>
-      <w:bookmarkStart w:id="68" w:name="r-skab"/>
+      <w:bookmarkStart w:id="67" w:name="r-skab"/>
       <w:r>
         <w:t xml:space="preserve">I. D. Katser and V. O. Kozitsin. “Skoltech Anomaly Benchmark (SKAB).” Kaggle</w:t>
       </w:r>
@@ -17410,7 +17398,7 @@
       <w:r>
         <w:t xml:space="preserve"> </w:t>
       </w:r>
-      <w:hyperlink r:id="rId67">
+      <w:hyperlink r:id="rId66">
         <w:r>
           <w:rPr>
             <w:rStyle w:val="Hyperlink"/>
@@ -17421,7 +17409,7 @@
       <w:r>
         <w:t xml:space="preserve">.</w:t>
       </w:r>
-      <w:bookmarkEnd w:id="68"/>
+      <w:bookmarkEnd w:id="67"/>
     </w:p>
     <w:p>
       <w:pPr>
@@ -17440,14 +17428,14 @@
         </w:rPr>
         <w:t xml:space="preserve">16. </w:t>
       </w:r>
-      <w:bookmarkStart w:id="70" w:name="r-bouman"/>
+      <w:bookmarkStart w:id="69" w:name="r-bouman"/>
       <w:r>
         <w:t xml:space="preserve">R. Bouman and T. Heskes. “Autoencoders for Anomaly Detection are Unreliable.” arXiv preprint, 2025.</w:t>
       </w:r>
       <w:r>
         <w:t xml:space="preserve"> </w:t>
       </w:r>
-      <w:hyperlink r:id="rId69">
+      <w:hyperlink r:id="rId68">
         <w:r>
           <w:rPr>
             <w:rStyle w:val="Hyperlink"/>
@@ -17458,7 +17446,7 @@
       <w:r>
         <w:t xml:space="preserve">.</w:t>
       </w:r>
-      <w:bookmarkEnd w:id="70"/>
+      <w:bookmarkEnd w:id="69"/>
     </w:p>
     <w:p>
       <w:pPr>
@@ -17477,7 +17465,7 @@
         </w:rPr>
         <w:t xml:space="preserve">17. </w:t>
       </w:r>
-      <w:bookmarkStart w:id="72" w:name="r-memae"/>
+      <w:bookmarkStart w:id="71" w:name="r-memae"/>
       <w:r>
         <w:t xml:space="preserve">D. Gong, L. Liu, V. Le, B. Saha, M. R. Mansour, S. Venkatesh, and A. van den Hengel. “Memorizing Normality to Detect Anomaly: Memory-augmented Deep Autoencoder for Unsupervised Anomaly Detection.”</w:t>
       </w:r>
@@ -17497,7 +17485,7 @@
       <w:r>
         <w:t xml:space="preserve"> </w:t>
       </w:r>
-      <w:hyperlink r:id="rId71">
+      <w:hyperlink r:id="rId70">
         <w:r>
           <w:rPr>
             <w:rStyle w:val="Hyperlink"/>
@@ -17508,7 +17496,7 @@
       <w:r>
         <w:t xml:space="preserve">.</w:t>
       </w:r>
-      <w:bookmarkEnd w:id="72"/>
+      <w:bookmarkEnd w:id="71"/>
     </w:p>
     <w:p>
       <w:pPr>
@@ -17527,7 +17515,7 @@
         </w:rPr>
         <w:t xml:space="preserve">18. </w:t>
       </w:r>
-      <w:bookmarkStart w:id="74" w:name="r-sarfraz"/>
+      <w:bookmarkStart w:id="73" w:name="r-sarfraz"/>
       <w:r>
         <w:t xml:space="preserve">M. S. Sarfraz, M.-Y. Chen, L. Layer, K. Peng, and M. Koulakis. “Position: Quo Vadis, Unsupervised Time Series Anomaly Detection?”</w:t>
       </w:r>
@@ -17547,7 +17535,7 @@
       <w:r>
         <w:t xml:space="preserve"> </w:t>
       </w:r>
-      <w:hyperlink r:id="rId73">
+      <w:hyperlink r:id="rId72">
         <w:r>
           <w:rPr>
             <w:rStyle w:val="Hyperlink"/>
@@ -17558,7 +17546,7 @@
       <w:r>
         <w:t xml:space="preserve">.</w:t>
       </w:r>
-      <w:bookmarkEnd w:id="74"/>
+      <w:bookmarkEnd w:id="73"/>
     </w:p>
     <w:p>
       <w:pPr>
@@ -17577,7 +17565,7 @@
         </w:rPr>
         <w:t xml:space="preserve">19. </w:t>
       </w:r>
-      <w:bookmarkStart w:id="76" w:name="r-timesead"/>
+      <w:bookmarkStart w:id="75" w:name="r-timesead"/>
       <w:r>
         <w:t xml:space="preserve">D. Wagner, T. Michels, F. C. F. Schulz, A. Nair, M. Rudolph, and M. Kloft. “TimeSeAD: Benchmarking Deep Multivariate Time-Series Anomaly Detection.”</w:t>
       </w:r>
@@ -17597,7 +17585,7 @@
       <w:r>
         <w:t xml:space="preserve"> </w:t>
       </w:r>
-      <w:hyperlink r:id="rId75">
+      <w:hyperlink r:id="rId74">
         <w:r>
           <w:rPr>
             <w:rStyle w:val="Hyperlink"/>
@@ -17608,7 +17596,7 @@
       <w:r>
         <w:t xml:space="preserve">.</w:t>
       </w:r>
-      <w:bookmarkEnd w:id="76"/>
+      <w:bookmarkEnd w:id="75"/>
     </w:p>
     <w:p>
       <w:pPr>
@@ -17627,7 +17615,7 @@
         </w:rPr>
         <w:t xml:space="preserve">20. </w:t>
       </w:r>
-      <w:bookmarkStart w:id="78" w:name="r-swat"/>
+      <w:bookmarkStart w:id="77" w:name="r-swat"/>
       <w:r>
         <w:t xml:space="preserve">A. P. Mathur and N. O. Tippenhauer. “SWaT: A Water Treatment Testbed for Research and Training on ICS Security.”</w:t>
       </w:r>
@@ -17647,7 +17635,7 @@
       <w:r>
         <w:t xml:space="preserve"> </w:t>
       </w:r>
-      <w:hyperlink r:id="rId77">
+      <w:hyperlink r:id="rId76">
         <w:r>
           <w:rPr>
             <w:rStyle w:val="Hyperlink"/>
@@ -17658,7 +17646,7 @@
       <w:r>
         <w:t xml:space="preserve">.</w:t>
       </w:r>
-      <w:bookmarkEnd w:id="78"/>
+      <w:bookmarkEnd w:id="77"/>
     </w:p>
     <w:p>
       <w:pPr>
@@ -17677,7 +17665,7 @@
         </w:rPr>
         <w:t xml:space="preserve">21. </w:t>
       </w:r>
-      <w:bookmarkStart w:id="80" w:name="r-aead"/>
+      <w:bookmarkStart w:id="79" w:name="r-aead"/>
       <w:r>
         <w:t xml:space="preserve">M. Sakurada and T. Yairi. “Anomaly Detection Using Autoencoders with Nonlinear Dimensionality Reduction.”</w:t>
       </w:r>
@@ -17697,7 +17685,7 @@
       <w:r>
         <w:t xml:space="preserve"> </w:t>
       </w:r>
-      <w:hyperlink r:id="rId79">
+      <w:hyperlink r:id="rId78">
         <w:r>
           <w:rPr>
             <w:rStyle w:val="Hyperlink"/>
@@ -17708,7 +17696,7 @@
       <w:r>
         <w:t xml:space="preserve">.</w:t>
       </w:r>
-      <w:bookmarkEnd w:id="80"/>
+      <w:bookmarkEnd w:id="79"/>
     </w:p>
     <w:p>
       <w:pPr>
@@ -17727,7 +17715,7 @@
         </w:rPr>
         <w:t xml:space="preserve">22. </w:t>
       </w:r>
-      <w:bookmarkStart w:id="82" w:name="r-chandola"/>
+      <w:bookmarkStart w:id="81" w:name="r-chandola"/>
       <w:r>
         <w:t xml:space="preserve">V. Chandola, A. Banerjee, and V. Kumar. “Anomaly Detection: A Survey.”</w:t>
       </w:r>
@@ -17747,7 +17735,7 @@
       <w:r>
         <w:t xml:space="preserve"> </w:t>
       </w:r>
-      <w:hyperlink r:id="rId81">
+      <w:hyperlink r:id="rId80">
         <w:r>
           <w:rPr>
             <w:rStyle w:val="Hyperlink"/>
@@ -17758,7 +17746,7 @@
       <w:r>
         <w:t xml:space="preserve">.</w:t>
       </w:r>
-      <w:bookmarkEnd w:id="82"/>
+      <w:bookmarkEnd w:id="81"/>
     </w:p>
     <w:p>
       <w:pPr>
@@ -17777,7 +17765,7 @@
         </w:rPr>
         <w:t xml:space="preserve">23. </w:t>
       </w:r>
-      <w:bookmarkStart w:id="84" w:name="r-pang"/>
+      <w:bookmarkStart w:id="83" w:name="r-pang"/>
       <w:r>
         <w:t xml:space="preserve">G. Pang, C. Shen, L. Cao, and A. van den Hengel. “Deep Learning for Anomaly Detection: A Review.”</w:t>
       </w:r>
@@ -17797,7 +17785,7 @@
       <w:r>
         <w:t xml:space="preserve"> </w:t>
       </w:r>
-      <w:hyperlink r:id="rId83">
+      <w:hyperlink r:id="rId82">
         <w:r>
           <w:rPr>
             <w:rStyle w:val="Hyperlink"/>
@@ -17808,7 +17796,7 @@
       <w:r>
         <w:t xml:space="preserve">, doi:10.1145/3439950.</w:t>
       </w:r>
-      <w:bookmarkEnd w:id="84"/>
+      <w:bookmarkEnd w:id="83"/>
     </w:p>
     <w:p>
       <w:pPr>
@@ -17827,7 +17815,7 @@
         </w:rPr>
         <w:t xml:space="preserve">24. </w:t>
       </w:r>
-      <w:bookmarkStart w:id="86" w:name="r-ruff"/>
+      <w:bookmarkStart w:id="85" w:name="r-ruff"/>
       <w:r>
         <w:t xml:space="preserve">L. Ruff, J. R. Kauffmann, R. A. Vandermeulen, G. Montavon, W. Samek, M. Kloft, T. G. Dietterich, and K.-R. Müller. “A Unifying Review of Deep and Shallow Anomaly Detection.”</w:t>
       </w:r>
@@ -17847,7 +17835,7 @@
       <w:r>
         <w:t xml:space="preserve"> </w:t>
       </w:r>
-      <w:hyperlink r:id="rId85">
+      <w:hyperlink r:id="rId84">
         <w:r>
           <w:rPr>
             <w:rStyle w:val="Hyperlink"/>
@@ -17858,7 +17846,7 @@
       <w:r>
         <w:t xml:space="preserve">, doi:10.1109/JPROC.2021.3052449.</w:t>
       </w:r>
-      <w:bookmarkEnd w:id="86"/>
+      <w:bookmarkEnd w:id="85"/>
     </w:p>
     <w:p>
       <w:pPr>
@@ -17877,7 +17865,7 @@
         </w:rPr>
         <w:t xml:space="preserve">25. </w:t>
       </w:r>
-      <w:bookmarkStart w:id="88" w:name="r-tsreview"/>
+      <w:bookmarkStart w:id="87" w:name="r-tsreview"/>
       <w:r>
         <w:t xml:space="preserve">A. Blázquez-García, A. Conde, U. Mori, and J. A. Lozano. “A Review on Outlier/Anomaly Detection in Time Series Data.”</w:t>
       </w:r>
@@ -17897,7 +17885,7 @@
       <w:r>
         <w:t xml:space="preserve"> </w:t>
       </w:r>
-      <w:hyperlink r:id="rId87">
+      <w:hyperlink r:id="rId86">
         <w:r>
           <w:rPr>
             <w:rStyle w:val="Hyperlink"/>
@@ -17908,7 +17896,7 @@
       <w:r>
         <w:t xml:space="preserve">, doi:10.1145/3444690.</w:t>
       </w:r>
-      <w:bookmarkEnd w:id="88"/>
+      <w:bookmarkEnd w:id="87"/>
     </w:p>
     <w:p>
       <w:pPr>
@@ -17927,7 +17915,7 @@
         </w:rPr>
         <w:t xml:space="preserve">26. </w:t>
       </w:r>
-      <w:bookmarkStart w:id="90" w:name="r-icssurvey"/>
+      <w:bookmarkStart w:id="89" w:name="r-icssurvey"/>
       <w:r>
         <w:t xml:space="preserve">Y. Hu, A. Yang, H. Li, Y. Sun, and L. Sun. “A Survey of Intrusion Detection on Industrial Control Systems.”</w:t>
       </w:r>
@@ -17947,7 +17935,7 @@
       <w:r>
         <w:t xml:space="preserve"> </w:t>
       </w:r>
-      <w:hyperlink r:id="rId89">
+      <w:hyperlink r:id="rId88">
         <w:r>
           <w:rPr>
             <w:rStyle w:val="Hyperlink"/>
@@ -17958,10 +17946,10 @@
       <w:r>
         <w:t xml:space="preserve">.</w:t>
       </w:r>
-      <w:bookmarkEnd w:id="90"/>
+      <w:bookmarkEnd w:id="89"/>
     </w:p>
+    <w:bookmarkEnd w:id="90"/>
     <w:bookmarkEnd w:id="91"/>
-    <w:bookmarkEnd w:id="92"/>
     <w:sectPr>
       <w:footerReference w:type="default" r:id="rId9"/>
       <w:pgSz w:h="15840" w:w="12240"/>

</xml_diff>